<commit_message>
chore(docs): fix sarung typo in TEKNIS PACKING PUTRI SESI 1,2,3.docx
Tas ransel Sesi 3 -> Mukenah (konteks alat sholat), perlengkapan pelajaran MQ
di koper -> sewek. Menyamakan dokumen sumber dengan yang sudah tampil di web.

Co-Authored-By: Claude Opus 5 (1M context) <noreply@anthropic.com>
</commit_message>
<xml_diff>
--- a/TEKNIS PACKING PUTRI SESI 1,2,3.docx
+++ b/TEKNIS PACKING PUTRI SESI 1,2,3.docx
@@ -1309,7 +1309,7 @@
           <w:sz w:val="24"/>
           <w:szCs w:val="24"/>
         </w:rPr>
-        <w:t>Sarung dan sajadah pribadi</w:t>
+        <w:t>Mukenah dan sajadah pribadi</w:t>
       </w:r>
     </w:p>
     <w:p>
@@ -1654,7 +1654,7 @@
           <w:sz w:val="24"/>
           <w:szCs w:val="24"/>
         </w:rPr>
-        <w:t>, kemeja putih, sarung, dan sandal )</w:t>
+        <w:t>, kemeja putih, sewek, dan sandal )</w:t>
       </w:r>
     </w:p>
     <w:p>

</xml_diff>